<commit_message>
Trocar a frase de metodologia por conteúdo clínico nos dois resumos
Sai a descrição do tipo de estudo e do recorte temporal, que ocupava espaço
sem dizer nada sobre o tema. No resumo de TEA entra a recomendação de que a
primeira consulta seja só de adaptação; no de tecnologia entram o diamino
fluoreto de prata e os critérios de escolha do recurso, com a referência
correspondente da AAPD.

263 e 264 palavras. O README registra as frases de materiais e métodos
prontas, caso a orientadora peça o item de volta.

Co-Authored-By: Claude Opus 5 <noreply@anthropic.com>
Claude-Session: https://claude.ai/code/session_01KV9dw4gzFi44p1bVc4t4nV
</commit_message>
<xml_diff>
--- a/resumo-banner-pne/Resumo_Banner_PNE_Tecnologia.docx
+++ b/resumo-banner-pne/Resumo_Banner_PNE_Tecnologia.docx
@@ -82,7 +82,7 @@
           <w:b w:val="0"/>
           <w:sz w:val="24"/>
         </w:rPr>
-        <w:t>As pessoas com deficiência enfrentam barreiras importantes de acesso ao cuidado bucal, que envolvem comunicação, comportamento, ambiente e acessibilidade física. O resultado é pior saúde bucal, diagnóstico tardio e boa parte dos tratamentos feitos apenas sob sedação ou anestesia geral. Nos últimos anos, recursos tecnológicos passaram a ser incorporados ao atendimento para reduzir essas barreiras. O objetivo deste trabalho é apresentar os recursos tecnológicos aplicáveis à consulta odontológica do paciente com necessidades especiais e a evidência que sustenta cada um. Trata-se de uma revisão de literatura, com artigos publicados entre 2015 e 2025 e diretrizes nacionais e internacionais. Os recursos podem ser organizados por grau de complexidade. Entre os de baixa complexidade estão a pedagogia visual digital e a modelagem por vídeo, que preparam o paciente antes da consulta e reduzem o número de sessões necessárias, os aplicativos de comunicação alternativa e a escova elétrica, útil quando a higiene depende do cuidador. Entre os de média complexidade estão o ambiente sensorialmente adaptado, com controle de luz, som e estímulo tátil, que reduz o estresse fisiológico e comportamental, a realidade virtual como forma de distração e a teleodontologia, que amplia o acesso e orienta o cuidador a distância. Entre os de alta complexidade aparecem o diagnóstico auxiliado por inteligência artificial, o laser para remoção de cárie sem o ruído da alta rotação e a monitorização durante a sedação. Conclui-se que os recursos com melhor evidência são, em geral, os mais simples e baratos, e que a tecnologia não substitui o vínculo e o manejo comportamental, mas amplia o acesso ao tratamento.</w:t>
+        <w:t>As pessoas com deficiência enfrentam barreiras importantes de acesso ao cuidado bucal, que envolvem comunicação, comportamento, ambiente e acessibilidade física. O resultado é pior saúde bucal, diagnóstico tardio e tratamentos feitos apenas sob sedação ou anestesia geral. Nos últimos anos, recursos tecnológicos passaram a ser incorporados ao atendimento para reduzir essas barreiras. O objetivo deste trabalho é apresentar os recursos tecnológicos aplicáveis à consulta odontológica do paciente com necessidades especiais e a evidência que sustenta cada um. Os recursos podem ser organizados por complexidade. Entre os de baixa complexidade estão a pedagogia visual digital e a modelagem por vídeo, que preparam o paciente antes da consulta e reduzem o número de sessões necessárias, os aplicativos de comunicação alternativa, a escova elétrica, útil quando a higiene depende do cuidador, e o diamino fluoreto de prata, que paralisa a lesão de cárie sem preparo cavitário. Entre os de média complexidade estão o ambiente sensorialmente adaptado, com controle de luz, som e estímulo tátil, que reduz o estresse fisiológico e comportamental, a realidade virtual como forma de distração e a teleodontologia, que amplia o acesso e orienta o cuidador a distância. Entre os de alta complexidade aparecem o diagnóstico auxiliado por inteligência artificial, o laser para remoção de cárie sem o ruído da alta rotação e a monitorização durante a sedação. A escolha deve considerar custo, treinamento da equipe e a realidade do serviço. Conclui-se que os recursos com melhor evidência são, em geral, os mais simples e baratos, e que a tecnologia não substitui o vínculo e o manejo comportamental, mas amplia o acesso ao tratamento.</w:t>
       </w:r>
     </w:p>
     <w:p>
@@ -125,6 +125,20 @@
           <w:sz w:val="24"/>
         </w:rPr>
         <w:t>AMERICAN ACADEMY OF PEDIATRIC DENTISTRY. Behavior guidance for the pediatric dental patient. In: The Reference Manual of Pediatric Dentistry. Chicago: AAPD, 2024. p. 358-378.</w:t>
+      </w:r>
+    </w:p>
+    <w:p>
+      <w:pPr>
+        <w:spacing w:line="240" w:lineRule="auto" w:before="0" w:after="120"/>
+        <w:jc w:val="both"/>
+      </w:pPr>
+      <w:r>
+        <w:rPr>
+          <w:rFonts w:ascii="Arial" w:hAnsi="Arial" w:cs="Arial"/>
+          <w:b w:val="0"/>
+          <w:sz w:val="24"/>
+        </w:rPr>
+        <w:t>AMERICAN ACADEMY OF PEDIATRIC DENTISTRY. Policy on the use of silver diamine fluoride for pediatric dental patients. In: The Reference Manual of Pediatric Dentistry. Chicago: AAPD, 2024.</w:t>
       </w:r>
     </w:p>
     <w:p>

</xml_diff>